<commit_message>
Keep Word figures and table headers together
</commit_message>
<xml_diff>
--- a/论文对比资料_2026-08-23/08_直白表达与完整图表论文_2026-08-24/行为树论文_Word修改版_直白表达与完整图表_2026-08-24.docx
+++ b/论文对比资料_2026-08-23/08_直白表达与完整图表论文_2026-08-24/行为树论文_Word修改版_直白表达与完整图表_2026-08-24.docx
@@ -896,6 +896,7 @@
     </w:p>
     <w:p>
       <w:pPr>
+        <w:keepNext/>
         <w:jc w:val="center"/>
       </w:pPr>
       <w:r>
@@ -919,6 +920,10 @@
         <w:gridCol w:w="2835"/>
       </w:tblGrid>
       <w:tr>
+        <w:trPr>
+          <w:tblHeader w:val="true"/>
+          <w:cantSplit/>
+        </w:trPr>
         <w:tc>
           <w:tcPr>
             <w:tcW w:type="dxa" w:w="2835"/>
@@ -963,6 +968,9 @@
         </w:tc>
       </w:tr>
       <w:tr>
+        <w:trPr>
+          <w:cantSplit/>
+        </w:trPr>
         <w:tc>
           <w:tcPr>
             <w:tcW w:type="dxa" w:w="2835"/>
@@ -995,6 +1003,9 @@
         </w:tc>
       </w:tr>
       <w:tr>
+        <w:trPr>
+          <w:cantSplit/>
+        </w:trPr>
         <w:tc>
           <w:tcPr>
             <w:tcW w:type="dxa" w:w="2835"/>
@@ -1027,6 +1038,9 @@
         </w:tc>
       </w:tr>
       <w:tr>
+        <w:trPr>
+          <w:cantSplit/>
+        </w:trPr>
         <w:tc>
           <w:tcPr>
             <w:tcW w:type="dxa" w:w="2835"/>
@@ -1059,6 +1073,9 @@
         </w:tc>
       </w:tr>
       <w:tr>
+        <w:trPr>
+          <w:cantSplit/>
+        </w:trPr>
         <w:tc>
           <w:tcPr>
             <w:tcW w:type="dxa" w:w="2835"/>
@@ -1091,6 +1108,9 @@
         </w:tc>
       </w:tr>
       <w:tr>
+        <w:trPr>
+          <w:cantSplit/>
+        </w:trPr>
         <w:tc>
           <w:tcPr>
             <w:tcW w:type="dxa" w:w="2835"/>
@@ -1123,6 +1143,9 @@
         </w:tc>
       </w:tr>
       <w:tr>
+        <w:trPr>
+          <w:cantSplit/>
+        </w:trPr>
         <w:tc>
           <w:tcPr>
             <w:tcW w:type="dxa" w:w="2835"/>
@@ -1376,6 +1399,7 @@
     </w:p>
     <w:p>
       <w:pPr>
+        <w:keepNext/>
         <w:jc w:val="center"/>
       </w:pPr>
       <w:r>
@@ -1398,6 +1422,10 @@
         <w:gridCol w:w="4252"/>
       </w:tblGrid>
       <w:tr>
+        <w:trPr>
+          <w:tblHeader w:val="true"/>
+          <w:cantSplit/>
+        </w:trPr>
         <w:tc>
           <w:tcPr>
             <w:tcW w:type="dxa" w:w="4252"/>
@@ -1428,6 +1456,9 @@
         </w:tc>
       </w:tr>
       <w:tr>
+        <w:trPr>
+          <w:cantSplit/>
+        </w:trPr>
         <w:tc>
           <w:tcPr>
             <w:tcW w:type="dxa" w:w="4252"/>
@@ -1450,6 +1481,9 @@
         </w:tc>
       </w:tr>
       <w:tr>
+        <w:trPr>
+          <w:cantSplit/>
+        </w:trPr>
         <w:tc>
           <w:tcPr>
             <w:tcW w:type="dxa" w:w="4252"/>
@@ -1472,6 +1506,9 @@
         </w:tc>
       </w:tr>
       <w:tr>
+        <w:trPr>
+          <w:cantSplit/>
+        </w:trPr>
         <w:tc>
           <w:tcPr>
             <w:tcW w:type="dxa" w:w="4252"/>
@@ -1494,6 +1531,9 @@
         </w:tc>
       </w:tr>
       <w:tr>
+        <w:trPr>
+          <w:cantSplit/>
+        </w:trPr>
         <w:tc>
           <w:tcPr>
             <w:tcW w:type="dxa" w:w="4252"/>
@@ -1516,6 +1556,9 @@
         </w:tc>
       </w:tr>
       <w:tr>
+        <w:trPr>
+          <w:cantSplit/>
+        </w:trPr>
         <w:tc>
           <w:tcPr>
             <w:tcW w:type="dxa" w:w="4252"/>
@@ -1538,6 +1581,9 @@
         </w:tc>
       </w:tr>
       <w:tr>
+        <w:trPr>
+          <w:cantSplit/>
+        </w:trPr>
         <w:tc>
           <w:tcPr>
             <w:tcW w:type="dxa" w:w="4252"/>
@@ -1560,6 +1606,9 @@
         </w:tc>
       </w:tr>
       <w:tr>
+        <w:trPr>
+          <w:cantSplit/>
+        </w:trPr>
         <w:tc>
           <w:tcPr>
             <w:tcW w:type="dxa" w:w="4252"/>
@@ -1582,6 +1631,9 @@
         </w:tc>
       </w:tr>
       <w:tr>
+        <w:trPr>
+          <w:cantSplit/>
+        </w:trPr>
         <w:tc>
           <w:tcPr>
             <w:tcW w:type="dxa" w:w="4252"/>
@@ -1604,6 +1656,9 @@
         </w:tc>
       </w:tr>
       <w:tr>
+        <w:trPr>
+          <w:cantSplit/>
+        </w:trPr>
         <w:tc>
           <w:tcPr>
             <w:tcW w:type="dxa" w:w="4252"/>
@@ -1626,6 +1681,9 @@
         </w:tc>
       </w:tr>
       <w:tr>
+        <w:trPr>
+          <w:cantSplit/>
+        </w:trPr>
         <w:tc>
           <w:tcPr>
             <w:tcW w:type="dxa" w:w="4252"/>
@@ -1779,6 +1837,9 @@
         <w:gridCol w:w="4252"/>
       </w:tblGrid>
       <w:tr>
+        <w:trPr>
+          <w:cantSplit/>
+        </w:trPr>
         <w:tc>
           <w:tcPr>
             <w:tcW w:type="dxa" w:w="4252"/>
@@ -1968,6 +2029,7 @@
     </w:p>
     <w:p>
       <w:pPr>
+        <w:keepNext/>
         <w:jc w:val="center"/>
       </w:pPr>
       <w:r>
@@ -1992,6 +2054,10 @@
         <w:gridCol w:w="2126"/>
       </w:tblGrid>
       <w:tr>
+        <w:trPr>
+          <w:tblHeader w:val="true"/>
+          <w:cantSplit/>
+        </w:trPr>
         <w:tc>
           <w:tcPr>
             <w:tcW w:type="dxa" w:w="2126"/>
@@ -2050,6 +2116,9 @@
         </w:tc>
       </w:tr>
       <w:tr>
+        <w:trPr>
+          <w:cantSplit/>
+        </w:trPr>
         <w:tc>
           <w:tcPr>
             <w:tcW w:type="dxa" w:w="2126"/>
@@ -2092,6 +2161,9 @@
         </w:tc>
       </w:tr>
       <w:tr>
+        <w:trPr>
+          <w:cantSplit/>
+        </w:trPr>
         <w:tc>
           <w:tcPr>
             <w:tcW w:type="dxa" w:w="2126"/>
@@ -2134,6 +2206,9 @@
         </w:tc>
       </w:tr>
       <w:tr>
+        <w:trPr>
+          <w:cantSplit/>
+        </w:trPr>
         <w:tc>
           <w:tcPr>
             <w:tcW w:type="dxa" w:w="2126"/>
@@ -2176,6 +2251,9 @@
         </w:tc>
       </w:tr>
       <w:tr>
+        <w:trPr>
+          <w:cantSplit/>
+        </w:trPr>
         <w:tc>
           <w:tcPr>
             <w:tcW w:type="dxa" w:w="2126"/>
@@ -2218,6 +2296,9 @@
         </w:tc>
       </w:tr>
       <w:tr>
+        <w:trPr>
+          <w:cantSplit/>
+        </w:trPr>
         <w:tc>
           <w:tcPr>
             <w:tcW w:type="dxa" w:w="2126"/>
@@ -2283,6 +2364,7 @@
     </w:p>
     <w:p>
       <w:pPr>
+        <w:keepNext/>
         <w:jc w:val="center"/>
       </w:pPr>
       <w:r>
@@ -2309,6 +2391,10 @@
         <w:gridCol w:w="1417"/>
       </w:tblGrid>
       <w:tr>
+        <w:trPr>
+          <w:tblHeader w:val="true"/>
+          <w:cantSplit/>
+        </w:trPr>
         <w:tc>
           <w:tcPr>
             <w:tcW w:type="dxa" w:w="1417"/>
@@ -2395,6 +2481,9 @@
         </w:tc>
       </w:tr>
       <w:tr>
+        <w:trPr>
+          <w:cantSplit/>
+        </w:trPr>
         <w:tc>
           <w:tcPr>
             <w:tcW w:type="dxa" w:w="1417"/>
@@ -2457,6 +2546,9 @@
         </w:tc>
       </w:tr>
       <w:tr>
+        <w:trPr>
+          <w:cantSplit/>
+        </w:trPr>
         <w:tc>
           <w:tcPr>
             <w:tcW w:type="dxa" w:w="1417"/>
@@ -2519,6 +2611,9 @@
         </w:tc>
       </w:tr>
       <w:tr>
+        <w:trPr>
+          <w:cantSplit/>
+        </w:trPr>
         <w:tc>
           <w:tcPr>
             <w:tcW w:type="dxa" w:w="1417"/>
@@ -2581,6 +2676,9 @@
         </w:tc>
       </w:tr>
       <w:tr>
+        <w:trPr>
+          <w:cantSplit/>
+        </w:trPr>
         <w:tc>
           <w:tcPr>
             <w:tcW w:type="dxa" w:w="1417"/>
@@ -2643,6 +2741,9 @@
         </w:tc>
       </w:tr>
       <w:tr>
+        <w:trPr>
+          <w:cantSplit/>
+        </w:trPr>
         <w:tc>
           <w:tcPr>
             <w:tcW w:type="dxa" w:w="1417"/>
@@ -2705,6 +2806,9 @@
         </w:tc>
       </w:tr>
       <w:tr>
+        <w:trPr>
+          <w:cantSplit/>
+        </w:trPr>
         <w:tc>
           <w:tcPr>
             <w:tcW w:type="dxa" w:w="1417"/>
@@ -2767,6 +2871,9 @@
         </w:tc>
       </w:tr>
       <w:tr>
+        <w:trPr>
+          <w:cantSplit/>
+        </w:trPr>
         <w:tc>
           <w:tcPr>
             <w:tcW w:type="dxa" w:w="1417"/>
@@ -2909,6 +3016,7 @@
     </w:p>
     <w:p>
       <w:pPr>
+        <w:keepNext/>
         <w:jc w:val="center"/>
       </w:pPr>
       <w:r>
@@ -2936,6 +3044,10 @@
         <w:gridCol w:w="1215"/>
       </w:tblGrid>
       <w:tr>
+        <w:trPr>
+          <w:tblHeader w:val="true"/>
+          <w:cantSplit/>
+        </w:trPr>
         <w:tc>
           <w:tcPr>
             <w:tcW w:type="dxa" w:w="1215"/>
@@ -3036,6 +3148,9 @@
         </w:tc>
       </w:tr>
       <w:tr>
+        <w:trPr>
+          <w:cantSplit/>
+        </w:trPr>
         <w:tc>
           <w:tcPr>
             <w:tcW w:type="dxa" w:w="1215"/>
@@ -3108,6 +3223,9 @@
         </w:tc>
       </w:tr>
       <w:tr>
+        <w:trPr>
+          <w:cantSplit/>
+        </w:trPr>
         <w:tc>
           <w:tcPr>
             <w:tcW w:type="dxa" w:w="1215"/>
@@ -3180,6 +3298,9 @@
         </w:tc>
       </w:tr>
       <w:tr>
+        <w:trPr>
+          <w:cantSplit/>
+        </w:trPr>
         <w:tc>
           <w:tcPr>
             <w:tcW w:type="dxa" w:w="1215"/>
@@ -3633,6 +3754,7 @@
     </w:p>
     <w:p>
       <w:pPr>
+        <w:keepNext/>
         <w:jc w:val="center"/>
       </w:pPr>
       <w:r>
@@ -3656,6 +3778,10 @@
         <w:gridCol w:w="2835"/>
       </w:tblGrid>
       <w:tr>
+        <w:trPr>
+          <w:tblHeader w:val="true"/>
+          <w:cantSplit/>
+        </w:trPr>
         <w:tc>
           <w:tcPr>
             <w:tcW w:type="dxa" w:w="2835"/>
@@ -3700,6 +3826,9 @@
         </w:tc>
       </w:tr>
       <w:tr>
+        <w:trPr>
+          <w:cantSplit/>
+        </w:trPr>
         <w:tc>
           <w:tcPr>
             <w:tcW w:type="dxa" w:w="2835"/>
@@ -3732,6 +3861,9 @@
         </w:tc>
       </w:tr>
       <w:tr>
+        <w:trPr>
+          <w:cantSplit/>
+        </w:trPr>
         <w:tc>
           <w:tcPr>
             <w:tcW w:type="dxa" w:w="2835"/>
@@ -3764,6 +3896,9 @@
         </w:tc>
       </w:tr>
       <w:tr>
+        <w:trPr>
+          <w:cantSplit/>
+        </w:trPr>
         <w:tc>
           <w:tcPr>
             <w:tcW w:type="dxa" w:w="2835"/>
@@ -3796,6 +3931,9 @@
         </w:tc>
       </w:tr>
       <w:tr>
+        <w:trPr>
+          <w:cantSplit/>
+        </w:trPr>
         <w:tc>
           <w:tcPr>
             <w:tcW w:type="dxa" w:w="2835"/>
@@ -3828,6 +3966,9 @@
         </w:tc>
       </w:tr>
       <w:tr>
+        <w:trPr>
+          <w:cantSplit/>
+        </w:trPr>
         <w:tc>
           <w:tcPr>
             <w:tcW w:type="dxa" w:w="2835"/>
@@ -3860,6 +4001,9 @@
         </w:tc>
       </w:tr>
       <w:tr>
+        <w:trPr>
+          <w:cantSplit/>
+        </w:trPr>
         <w:tc>
           <w:tcPr>
             <w:tcW w:type="dxa" w:w="2835"/>

</xml_diff>